<commit_message>
Final Edit with Screenshots
</commit_message>
<xml_diff>
--- a/module-1/RylanderSetup325.docx
+++ b/module-1/RylanderSetup325.docx
@@ -153,7 +153,7 @@
       <w:pPr>
         <w:pStyle w:val="Normal"/>
       </w:pPr>
-      <w:hyperlink r:id="Rb686452177a74773">
+      <w:hyperlink r:id="R439ec5da31f34fcc">
         <w:r>
           <w:rPr>
             <w:rStyle w:val="Hyperlink"/>
@@ -204,7 +204,7 @@
       </w:r>
       <w:r>
         <w:drawing>
-          <wp:inline xmlns:wp14="http://schemas.microsoft.com/office/word/2010/wordprocessingDrawing" wp14:editId="720F32C1" wp14:anchorId="6E7D1254">
+          <wp:inline xmlns:wp14="http://schemas.microsoft.com/office/word/2010/wordprocessingDrawing" wp14:editId="634A36EC" wp14:anchorId="6E7D1254">
             <wp:extent cx="4648200" cy="5943600"/>
             <wp:effectExtent l="0" t="0" r="0" b="0"/>
             <wp:docPr id="1761012849" name="drawing"/>
@@ -281,7 +281,7 @@
         <w:t>GitHub Repository Screenshot:</w:t>
       </w:r>
     </w:p>
-    <w:p xmlns:wp14="http://schemas.microsoft.com/office/word/2010/wordml" wp14:paraId="42AEC0D0" wp14:textId="7CE8FDDF">
+    <w:p xmlns:wp14="http://schemas.microsoft.com/office/word/2010/wordml" wp14:paraId="42AEC0D0" wp14:textId="588692B0">
       <w:pPr>
         <w:pStyle w:val="Normal"/>
         <w:rPr>
@@ -299,6 +299,49 @@
           <w:lang w:val="en-US"/>
         </w:rPr>
       </w:pPr>
+      <w:r>
+        <w:drawing>
+          <wp:inline xmlns:wp14="http://schemas.microsoft.com/office/word/2010/wordprocessingDrawing" wp14:editId="78747385" wp14:anchorId="2B741F0E">
+            <wp:extent cx="5943600" cy="3362325"/>
+            <wp:effectExtent l="0" t="0" r="0" b="0"/>
+            <wp:docPr id="1083793268" name="drawing"/>
+            <wp:cNvGraphicFramePr>
+              <a:graphicFrameLocks noChangeAspect="1"/>
+            </wp:cNvGraphicFramePr>
+            <a:graphic>
+              <a:graphicData xmlns:a="http://schemas.openxmlformats.org/drawingml/2006/main" uri="http://schemas.openxmlformats.org/drawingml/2006/picture">
+                <pic:pic xmlns:pic="http://schemas.openxmlformats.org/drawingml/2006/picture">
+                  <pic:nvPicPr>
+                    <pic:cNvPr id="1083793268" name="Picture 1083793268"/>
+                    <pic:cNvPicPr/>
+                  </pic:nvPicPr>
+                  <pic:blipFill>
+                    <a:blip xmlns:r="http://schemas.openxmlformats.org/officeDocument/2006/relationships" r:embed="rId1696272324">
+                      <a:extLst>
+                        <a:ext uri="{28A0092B-C50C-407E-A947-70E740481C1C}">
+                          <a14:useLocalDpi xmlns:a14="http://schemas.microsoft.com/office/drawing/2010/main"/>
+                        </a:ext>
+                      </a:extLst>
+                    </a:blip>
+                    <a:stretch>
+                      <a:fillRect/>
+                    </a:stretch>
+                  </pic:blipFill>
+                  <pic:spPr>
+                    <a:xfrm>
+                      <a:off x="0" y="0"/>
+                      <a:ext cx="5943600" cy="3362325"/>
+                    </a:xfrm>
+                    <a:prstGeom prst="rect">
+                      <a:avLst/>
+                    </a:prstGeom>
+                  </pic:spPr>
+                </pic:pic>
+              </a:graphicData>
+            </a:graphic>
+          </wp:inline>
+        </w:drawing>
+      </w:r>
     </w:p>
     <w:p xmlns:wp14="http://schemas.microsoft.com/office/word/2010/wordml" wp14:paraId="50473859" wp14:textId="27649CCB">
       <w:pPr>
@@ -335,7 +378,51 @@
         <w:t>Module-1 Folder Screenshot:</w:t>
       </w:r>
     </w:p>
-    <w:p xmlns:wp14="http://schemas.microsoft.com/office/word/2010/wordml" wp14:paraId="766DC55C" wp14:textId="6B121771"/>
+    <w:p xmlns:wp14="http://schemas.microsoft.com/office/word/2010/wordml" wp14:paraId="766DC55C" wp14:textId="5021E568">
+      <w:r>
+        <w:drawing>
+          <wp:inline xmlns:wp14="http://schemas.microsoft.com/office/word/2010/wordprocessingDrawing" wp14:editId="2307B091" wp14:anchorId="60BCAE23">
+            <wp:extent cx="5943600" cy="1933575"/>
+            <wp:effectExtent l="0" t="0" r="0" b="0"/>
+            <wp:docPr id="1415929453" name="drawing"/>
+            <wp:cNvGraphicFramePr>
+              <a:graphicFrameLocks noChangeAspect="1"/>
+            </wp:cNvGraphicFramePr>
+            <a:graphic>
+              <a:graphicData xmlns:a="http://schemas.openxmlformats.org/drawingml/2006/main" uri="http://schemas.openxmlformats.org/drawingml/2006/picture">
+                <pic:pic xmlns:pic="http://schemas.openxmlformats.org/drawingml/2006/picture">
+                  <pic:nvPicPr>
+                    <pic:cNvPr id="1415929453" name="Picture 1415929453"/>
+                    <pic:cNvPicPr/>
+                  </pic:nvPicPr>
+                  <pic:blipFill>
+                    <a:blip xmlns:r="http://schemas.openxmlformats.org/officeDocument/2006/relationships" r:embed="rId1356602244">
+                      <a:extLst>
+                        <a:ext uri="{28A0092B-C50C-407E-A947-70E740481C1C}">
+                          <a14:useLocalDpi xmlns:a14="http://schemas.microsoft.com/office/drawing/2010/main"/>
+                        </a:ext>
+                      </a:extLst>
+                    </a:blip>
+                    <a:stretch>
+                      <a:fillRect/>
+                    </a:stretch>
+                  </pic:blipFill>
+                  <pic:spPr>
+                    <a:xfrm>
+                      <a:off x="0" y="0"/>
+                      <a:ext cx="5943600" cy="1933575"/>
+                    </a:xfrm>
+                    <a:prstGeom prst="rect">
+                      <a:avLst/>
+                    </a:prstGeom>
+                  </pic:spPr>
+                </pic:pic>
+              </a:graphicData>
+            </a:graphic>
+          </wp:inline>
+        </w:drawing>
+      </w:r>
+    </w:p>
     <w:p xmlns:wp14="http://schemas.microsoft.com/office/word/2010/wordml" wp14:paraId="2C078E63" wp14:textId="3B718941"/>
     <w:sectPr>
       <w:pgSz w:w="12240" w:h="15840" w:orient="portrait"/>
@@ -773,7 +860,7 @@
     <w:name w:val="Hyperlink"/>
     <w:basedOn w:val="DefaultParagraphFont"/>
     <w:unhideWhenUsed/>
-    <w:rsid w:val="7A70C39F"/>
+    <w:rsid w:val="446810BC"/>
     <w:rPr>
       <w:color w:val="467886"/>
       <w:u w:val="single"/>

</xml_diff>